<commit_message>
separacion de responsabilidades, uso de hooks
</commit_message>
<xml_diff>
--- a/backend_cices_system/src/main/resources/templates/plantilla_word.docx
+++ b/backend_cices_system/src/main/resources/templates/plantilla_word.docx
@@ -12,7 +12,12 @@
       </w:pPr>
     </w:p>
     <w:sectPr>
-      <w:headerReference w:type="default" r:id="rId6"/>
+      <w:headerReference w:type="even" r:id="rId6"/>
+      <w:headerReference w:type="default" r:id="rId7"/>
+      <w:footerReference w:type="even" r:id="rId8"/>
+      <w:footerReference w:type="default" r:id="rId9"/>
+      <w:headerReference w:type="first" r:id="rId10"/>
+      <w:footerReference w:type="first" r:id="rId11"/>
       <w:pgSz w:w="12240" w:h="15840"/>
       <w:pgMar w:top="1440" w:right="1440" w:bottom="1440" w:left="1440" w:header="708" w:footer="708" w:gutter="0"/>
       <w:cols w:space="708"/>
@@ -47,6 +52,36 @@
 </w:endnotes>
 </file>
 
+<file path=word/footer1.xml><?xml version="1.0" encoding="utf-8"?>
+<w:ftr xmlns:wpc="http://schemas.microsoft.com/office/word/2010/wordprocessingCanvas" xmlns:cx="http://schemas.microsoft.com/office/drawing/2014/chartex" xmlns:cx1="http://schemas.microsoft.com/office/drawing/2015/9/8/chartex" xmlns:cx2="http://schemas.microsoft.com/office/drawing/2015/10/21/chartex" xmlns:cx3="http://schemas.microsoft.com/office/drawing/2016/5/9/chartex" xmlns:cx4="http://schemas.microsoft.com/office/drawing/2016/5/10/chartex" xmlns:cx5="http://schemas.microsoft.com/office/drawing/2016/5/11/chartex" xmlns:cx6="http://schemas.microsoft.com/office/drawing/2016/5/12/chartex" xmlns:cx7="http://schemas.microsoft.com/office/drawing/2016/5/13/chartex" xmlns:cx8="http://schemas.microsoft.com/office/drawing/2016/5/14/chartex" xmlns:mc="http://schemas.openxmlformats.org/markup-compatibility/2006" xmlns:aink="http://schemas.microsoft.com/office/drawing/2016/ink" xmlns:am3d="http://schemas.microsoft.com/office/drawing/2017/model3d" xmlns:o="urn:schemas-microsoft-com:office:office" xmlns:oel="http://schemas.microsoft.com/office/2019/extlst" xmlns:r="http://schemas.openxmlformats.org/officeDocument/2006/relationships" xmlns:m="http://schemas.openxmlformats.org/officeDocument/2006/math" xmlns:v="urn:schemas-microsoft-com:vml" xmlns:wp14="http://schemas.microsoft.com/office/word/2010/wordprocessingDrawing" xmlns:wp="http://schemas.openxmlformats.org/drawingml/2006/wordprocessingDrawing" xmlns:w10="urn:schemas-microsoft-com:office:word" xmlns:w="http://schemas.openxmlformats.org/wordprocessingml/2006/main" xmlns:w14="http://schemas.microsoft.com/office/word/2010/wordml" xmlns:w15="http://schemas.microsoft.com/office/word/2012/wordml" xmlns:w16cex="http://schemas.microsoft.com/office/word/2018/wordml/cex" xmlns:w16cid="http://schemas.microsoft.com/office/word/2016/wordml/cid" xmlns:w16="http://schemas.microsoft.com/office/word/2018/wordml" xmlns:w16du="http://schemas.microsoft.com/office/word/2023/wordml/word16du" xmlns:w16sdtdh="http://schemas.microsoft.com/office/word/2020/wordml/sdtdatahash" xmlns:w16sdtfl="http://schemas.microsoft.com/office/word/2024/wordml/sdtformatlock" xmlns:w16se="http://schemas.microsoft.com/office/word/2015/wordml/symex" xmlns:wpg="http://schemas.microsoft.com/office/word/2010/wordprocessingGroup" xmlns:wpi="http://schemas.microsoft.com/office/word/2010/wordprocessingInk" xmlns:wne="http://schemas.microsoft.com/office/word/2006/wordml" xmlns:wps="http://schemas.microsoft.com/office/word/2010/wordprocessingShape" mc:Ignorable="w14 w15 w16se w16cid w16 w16cex w16sdtdh w16sdtfl w16du wp14">
+  <w:p>
+    <w:pPr>
+      <w:pStyle w:val="Footer"/>
+    </w:pPr>
+  </w:p>
+</w:ftr>
+</file>
+
+<file path=word/footer2.xml><?xml version="1.0" encoding="utf-8"?>
+<w:ftr xmlns:wpc="http://schemas.microsoft.com/office/word/2010/wordprocessingCanvas" xmlns:cx="http://schemas.microsoft.com/office/drawing/2014/chartex" xmlns:cx1="http://schemas.microsoft.com/office/drawing/2015/9/8/chartex" xmlns:cx2="http://schemas.microsoft.com/office/drawing/2015/10/21/chartex" xmlns:cx3="http://schemas.microsoft.com/office/drawing/2016/5/9/chartex" xmlns:cx4="http://schemas.microsoft.com/office/drawing/2016/5/10/chartex" xmlns:cx5="http://schemas.microsoft.com/office/drawing/2016/5/11/chartex" xmlns:cx6="http://schemas.microsoft.com/office/drawing/2016/5/12/chartex" xmlns:cx7="http://schemas.microsoft.com/office/drawing/2016/5/13/chartex" xmlns:cx8="http://schemas.microsoft.com/office/drawing/2016/5/14/chartex" xmlns:mc="http://schemas.openxmlformats.org/markup-compatibility/2006" xmlns:aink="http://schemas.microsoft.com/office/drawing/2016/ink" xmlns:am3d="http://schemas.microsoft.com/office/drawing/2017/model3d" xmlns:o="urn:schemas-microsoft-com:office:office" xmlns:oel="http://schemas.microsoft.com/office/2019/extlst" xmlns:r="http://schemas.openxmlformats.org/officeDocument/2006/relationships" xmlns:m="http://schemas.openxmlformats.org/officeDocument/2006/math" xmlns:v="urn:schemas-microsoft-com:vml" xmlns:wp14="http://schemas.microsoft.com/office/word/2010/wordprocessingDrawing" xmlns:wp="http://schemas.openxmlformats.org/drawingml/2006/wordprocessingDrawing" xmlns:w10="urn:schemas-microsoft-com:office:word" xmlns:w="http://schemas.openxmlformats.org/wordprocessingml/2006/main" xmlns:w14="http://schemas.microsoft.com/office/word/2010/wordml" xmlns:w15="http://schemas.microsoft.com/office/word/2012/wordml" xmlns:w16cex="http://schemas.microsoft.com/office/word/2018/wordml/cex" xmlns:w16cid="http://schemas.microsoft.com/office/word/2016/wordml/cid" xmlns:w16="http://schemas.microsoft.com/office/word/2018/wordml" xmlns:w16du="http://schemas.microsoft.com/office/word/2023/wordml/word16du" xmlns:w16sdtdh="http://schemas.microsoft.com/office/word/2020/wordml/sdtdatahash" xmlns:w16sdtfl="http://schemas.microsoft.com/office/word/2024/wordml/sdtformatlock" xmlns:w16se="http://schemas.microsoft.com/office/word/2015/wordml/symex" xmlns:wpg="http://schemas.microsoft.com/office/word/2010/wordprocessingGroup" xmlns:wpi="http://schemas.microsoft.com/office/word/2010/wordprocessingInk" xmlns:wne="http://schemas.microsoft.com/office/word/2006/wordml" xmlns:wps="http://schemas.microsoft.com/office/word/2010/wordprocessingShape" mc:Ignorable="w14 w15 w16se w16cid w16 w16cex w16sdtdh w16sdtfl w16du wp14">
+  <w:p>
+    <w:pPr>
+      <w:pStyle w:val="Footer"/>
+    </w:pPr>
+  </w:p>
+</w:ftr>
+</file>
+
+<file path=word/footer3.xml><?xml version="1.0" encoding="utf-8"?>
+<w:ftr xmlns:wpc="http://schemas.microsoft.com/office/word/2010/wordprocessingCanvas" xmlns:cx="http://schemas.microsoft.com/office/drawing/2014/chartex" xmlns:cx1="http://schemas.microsoft.com/office/drawing/2015/9/8/chartex" xmlns:cx2="http://schemas.microsoft.com/office/drawing/2015/10/21/chartex" xmlns:cx3="http://schemas.microsoft.com/office/drawing/2016/5/9/chartex" xmlns:cx4="http://schemas.microsoft.com/office/drawing/2016/5/10/chartex" xmlns:cx5="http://schemas.microsoft.com/office/drawing/2016/5/11/chartex" xmlns:cx6="http://schemas.microsoft.com/office/drawing/2016/5/12/chartex" xmlns:cx7="http://schemas.microsoft.com/office/drawing/2016/5/13/chartex" xmlns:cx8="http://schemas.microsoft.com/office/drawing/2016/5/14/chartex" xmlns:mc="http://schemas.openxmlformats.org/markup-compatibility/2006" xmlns:aink="http://schemas.microsoft.com/office/drawing/2016/ink" xmlns:am3d="http://schemas.microsoft.com/office/drawing/2017/model3d" xmlns:o="urn:schemas-microsoft-com:office:office" xmlns:oel="http://schemas.microsoft.com/office/2019/extlst" xmlns:r="http://schemas.openxmlformats.org/officeDocument/2006/relationships" xmlns:m="http://schemas.openxmlformats.org/officeDocument/2006/math" xmlns:v="urn:schemas-microsoft-com:vml" xmlns:wp14="http://schemas.microsoft.com/office/word/2010/wordprocessingDrawing" xmlns:wp="http://schemas.openxmlformats.org/drawingml/2006/wordprocessingDrawing" xmlns:w10="urn:schemas-microsoft-com:office:word" xmlns:w="http://schemas.openxmlformats.org/wordprocessingml/2006/main" xmlns:w14="http://schemas.microsoft.com/office/word/2010/wordml" xmlns:w15="http://schemas.microsoft.com/office/word/2012/wordml" xmlns:w16cex="http://schemas.microsoft.com/office/word/2018/wordml/cex" xmlns:w16cid="http://schemas.microsoft.com/office/word/2016/wordml/cid" xmlns:w16="http://schemas.microsoft.com/office/word/2018/wordml" xmlns:w16du="http://schemas.microsoft.com/office/word/2023/wordml/word16du" xmlns:w16sdtdh="http://schemas.microsoft.com/office/word/2020/wordml/sdtdatahash" xmlns:w16sdtfl="http://schemas.microsoft.com/office/word/2024/wordml/sdtformatlock" xmlns:w16se="http://schemas.microsoft.com/office/word/2015/wordml/symex" xmlns:wpg="http://schemas.microsoft.com/office/word/2010/wordprocessingGroup" xmlns:wpi="http://schemas.microsoft.com/office/word/2010/wordprocessingInk" xmlns:wne="http://schemas.microsoft.com/office/word/2006/wordml" xmlns:wps="http://schemas.microsoft.com/office/word/2010/wordprocessingShape" mc:Ignorable="w14 w15 w16se w16cid w16 w16cex w16sdtdh w16sdtfl w16du wp14">
+  <w:p>
+    <w:pPr>
+      <w:pStyle w:val="Footer"/>
+    </w:pPr>
+  </w:p>
+</w:ftr>
+</file>
+
 <file path=word/footnotes.xml><?xml version="1.0" encoding="utf-8"?>
 <w:footnotes xmlns:wpc="http://schemas.microsoft.com/office/word/2010/wordprocessingCanvas" xmlns:cx="http://schemas.microsoft.com/office/drawing/2014/chartex" xmlns:cx1="http://schemas.microsoft.com/office/drawing/2015/9/8/chartex" xmlns:cx2="http://schemas.microsoft.com/office/drawing/2015/10/21/chartex" xmlns:cx3="http://schemas.microsoft.com/office/drawing/2016/5/9/chartex" xmlns:cx4="http://schemas.microsoft.com/office/drawing/2016/5/10/chartex" xmlns:cx5="http://schemas.microsoft.com/office/drawing/2016/5/11/chartex" xmlns:cx6="http://schemas.microsoft.com/office/drawing/2016/5/12/chartex" xmlns:cx7="http://schemas.microsoft.com/office/drawing/2016/5/13/chartex" xmlns:cx8="http://schemas.microsoft.com/office/drawing/2016/5/14/chartex" xmlns:mc="http://schemas.openxmlformats.org/markup-compatibility/2006" xmlns:aink="http://schemas.microsoft.com/office/drawing/2016/ink" xmlns:am3d="http://schemas.microsoft.com/office/drawing/2017/model3d" xmlns:o="urn:schemas-microsoft-com:office:office" xmlns:oel="http://schemas.microsoft.com/office/2019/extlst" xmlns:r="http://schemas.openxmlformats.org/officeDocument/2006/relationships" xmlns:m="http://schemas.openxmlformats.org/officeDocument/2006/math" xmlns:v="urn:schemas-microsoft-com:vml" xmlns:wp14="http://schemas.microsoft.com/office/word/2010/wordprocessingDrawing" xmlns:wp="http://schemas.openxmlformats.org/drawingml/2006/wordprocessingDrawing" xmlns:w10="urn:schemas-microsoft-com:office:word" xmlns:w="http://schemas.openxmlformats.org/wordprocessingml/2006/main" xmlns:w14="http://schemas.microsoft.com/office/word/2010/wordml" xmlns:w15="http://schemas.microsoft.com/office/word/2012/wordml" xmlns:w16cex="http://schemas.microsoft.com/office/word/2018/wordml/cex" xmlns:w16cid="http://schemas.microsoft.com/office/word/2016/wordml/cid" xmlns:w16="http://schemas.microsoft.com/office/word/2018/wordml" xmlns:w16du="http://schemas.microsoft.com/office/word/2023/wordml/word16du" xmlns:w16sdtdh="http://schemas.microsoft.com/office/word/2020/wordml/sdtdatahash" xmlns:w16sdtfl="http://schemas.microsoft.com/office/word/2024/wordml/sdtformatlock" xmlns:w16se="http://schemas.microsoft.com/office/word/2015/wordml/symex" xmlns:wpg="http://schemas.microsoft.com/office/word/2010/wordprocessingGroup" xmlns:wpi="http://schemas.microsoft.com/office/word/2010/wordprocessingInk" xmlns:wne="http://schemas.microsoft.com/office/word/2006/wordml" xmlns:wps="http://schemas.microsoft.com/office/word/2010/wordprocessingShape" mc:Ignorable="w14 w15 w16se w16cid w16 w16cex w16sdtdh w16sdtfl w16du wp14">
   <w:footnote w:type="separator" w:id="-1">
@@ -74,6 +109,16 @@
 
 <file path=word/header1.xml><?xml version="1.0" encoding="utf-8"?>
 <w:hdr xmlns:wpc="http://schemas.microsoft.com/office/word/2010/wordprocessingCanvas" xmlns:cx="http://schemas.microsoft.com/office/drawing/2014/chartex" xmlns:cx1="http://schemas.microsoft.com/office/drawing/2015/9/8/chartex" xmlns:cx2="http://schemas.microsoft.com/office/drawing/2015/10/21/chartex" xmlns:cx3="http://schemas.microsoft.com/office/drawing/2016/5/9/chartex" xmlns:cx4="http://schemas.microsoft.com/office/drawing/2016/5/10/chartex" xmlns:cx5="http://schemas.microsoft.com/office/drawing/2016/5/11/chartex" xmlns:cx6="http://schemas.microsoft.com/office/drawing/2016/5/12/chartex" xmlns:cx7="http://schemas.microsoft.com/office/drawing/2016/5/13/chartex" xmlns:cx8="http://schemas.microsoft.com/office/drawing/2016/5/14/chartex" xmlns:mc="http://schemas.openxmlformats.org/markup-compatibility/2006" xmlns:aink="http://schemas.microsoft.com/office/drawing/2016/ink" xmlns:am3d="http://schemas.microsoft.com/office/drawing/2017/model3d" xmlns:o="urn:schemas-microsoft-com:office:office" xmlns:oel="http://schemas.microsoft.com/office/2019/extlst" xmlns:r="http://schemas.openxmlformats.org/officeDocument/2006/relationships" xmlns:m="http://schemas.openxmlformats.org/officeDocument/2006/math" xmlns:v="urn:schemas-microsoft-com:vml" xmlns:wp14="http://schemas.microsoft.com/office/word/2010/wordprocessingDrawing" xmlns:wp="http://schemas.openxmlformats.org/drawingml/2006/wordprocessingDrawing" xmlns:w10="urn:schemas-microsoft-com:office:word" xmlns:w="http://schemas.openxmlformats.org/wordprocessingml/2006/main" xmlns:w14="http://schemas.microsoft.com/office/word/2010/wordml" xmlns:w15="http://schemas.microsoft.com/office/word/2012/wordml" xmlns:w16cex="http://schemas.microsoft.com/office/word/2018/wordml/cex" xmlns:w16cid="http://schemas.microsoft.com/office/word/2016/wordml/cid" xmlns:w16="http://schemas.microsoft.com/office/word/2018/wordml" xmlns:w16du="http://schemas.microsoft.com/office/word/2023/wordml/word16du" xmlns:w16sdtdh="http://schemas.microsoft.com/office/word/2020/wordml/sdtdatahash" xmlns:w16sdtfl="http://schemas.microsoft.com/office/word/2024/wordml/sdtformatlock" xmlns:w16se="http://schemas.microsoft.com/office/word/2015/wordml/symex" xmlns:wpg="http://schemas.microsoft.com/office/word/2010/wordprocessingGroup" xmlns:wpi="http://schemas.microsoft.com/office/word/2010/wordprocessingInk" xmlns:wne="http://schemas.microsoft.com/office/word/2006/wordml" xmlns:wps="http://schemas.microsoft.com/office/word/2010/wordprocessingShape" mc:Ignorable="w14 w15 w16se w16cid w16 w16cex w16sdtdh w16sdtfl w16du wp14">
+  <w:p>
+    <w:pPr>
+      <w:pStyle w:val="Header"/>
+    </w:pPr>
+  </w:p>
+</w:hdr>
+</file>
+
+<file path=word/header2.xml><?xml version="1.0" encoding="utf-8"?>
+<w:hdr xmlns:wpc="http://schemas.microsoft.com/office/word/2010/wordprocessingCanvas" xmlns:cx="http://schemas.microsoft.com/office/drawing/2014/chartex" xmlns:cx1="http://schemas.microsoft.com/office/drawing/2015/9/8/chartex" xmlns:cx2="http://schemas.microsoft.com/office/drawing/2015/10/21/chartex" xmlns:cx3="http://schemas.microsoft.com/office/drawing/2016/5/9/chartex" xmlns:cx4="http://schemas.microsoft.com/office/drawing/2016/5/10/chartex" xmlns:cx5="http://schemas.microsoft.com/office/drawing/2016/5/11/chartex" xmlns:cx6="http://schemas.microsoft.com/office/drawing/2016/5/12/chartex" xmlns:cx7="http://schemas.microsoft.com/office/drawing/2016/5/13/chartex" xmlns:cx8="http://schemas.microsoft.com/office/drawing/2016/5/14/chartex" xmlns:mc="http://schemas.openxmlformats.org/markup-compatibility/2006" xmlns:aink="http://schemas.microsoft.com/office/drawing/2016/ink" xmlns:am3d="http://schemas.microsoft.com/office/drawing/2017/model3d" xmlns:o="urn:schemas-microsoft-com:office:office" xmlns:oel="http://schemas.microsoft.com/office/2019/extlst" xmlns:r="http://schemas.openxmlformats.org/officeDocument/2006/relationships" xmlns:m="http://schemas.openxmlformats.org/officeDocument/2006/math" xmlns:v="urn:schemas-microsoft-com:vml" xmlns:wp14="http://schemas.microsoft.com/office/word/2010/wordprocessingDrawing" xmlns:wp="http://schemas.openxmlformats.org/drawingml/2006/wordprocessingDrawing" xmlns:w10="urn:schemas-microsoft-com:office:word" xmlns:w="http://schemas.openxmlformats.org/wordprocessingml/2006/main" xmlns:w14="http://schemas.microsoft.com/office/word/2010/wordml" xmlns:w15="http://schemas.microsoft.com/office/word/2012/wordml" xmlns:w16cex="http://schemas.microsoft.com/office/word/2018/wordml/cex" xmlns:w16cid="http://schemas.microsoft.com/office/word/2016/wordml/cid" xmlns:w16="http://schemas.microsoft.com/office/word/2018/wordml" xmlns:w16du="http://schemas.microsoft.com/office/word/2023/wordml/word16du" xmlns:w16sdtdh="http://schemas.microsoft.com/office/word/2020/wordml/sdtdatahash" xmlns:w16sdtfl="http://schemas.microsoft.com/office/word/2024/wordml/sdtformatlock" xmlns:w16se="http://schemas.microsoft.com/office/word/2015/wordml/symex" xmlns:wpg="http://schemas.microsoft.com/office/word/2010/wordprocessingGroup" xmlns:wpi="http://schemas.microsoft.com/office/word/2010/wordprocessingInk" xmlns:wne="http://schemas.microsoft.com/office/word/2006/wordml" xmlns:wps="http://schemas.microsoft.com/office/word/2010/wordprocessingShape" mc:Ignorable="w14 w15 w16se w16cid w16 w16cex w16sdtdh w16sdtfl w16du wp14">
   <w:tbl>
     <w:tblPr>
       <w:tblW w:w="5000" w:type="pct"/>
@@ -88,9 +133,9 @@
       <w:tblLook w:val="04A0" w:firstRow="1" w:lastRow="0" w:firstColumn="1" w:lastColumn="0" w:noHBand="0" w:noVBand="1"/>
     </w:tblPr>
     <w:tblGrid>
-      <w:gridCol w:w="2671"/>
+      <w:gridCol w:w="2703"/>
       <w:gridCol w:w="3967"/>
-      <w:gridCol w:w="2702"/>
+      <w:gridCol w:w="2670"/>
     </w:tblGrid>
     <w:tr>
       <w:tc>
@@ -102,6 +147,7 @@
             <w:tabs>
               <w:tab w:val="center" w:pos="1449"/>
             </w:tabs>
+            <w:spacing w:after="0"/>
             <w:jc w:val="center"/>
           </w:pPr>
           <w:r>
@@ -109,10 +155,10 @@
               <w:noProof/>
             </w:rPr>
             <w:drawing>
-              <wp:inline distT="0" distB="0" distL="0" distR="0" wp14:anchorId="3F0D47F1" wp14:editId="21C55376">
-                <wp:extent cx="1143000" cy="857250"/>
+              <wp:inline distT="0" distB="0" distL="0" distR="0" wp14:anchorId="0CCA30E3" wp14:editId="7FAE8213">
+                <wp:extent cx="1158240" cy="868680"/>
                 <wp:effectExtent l="0" t="0" r="0" b="0"/>
-                <wp:docPr id="444468233" name="Picture 1"/>
+                <wp:docPr id="1680470011" name="Picture 2"/>
                 <wp:cNvGraphicFramePr>
                   <a:graphicFrameLocks xmlns:a="http://schemas.openxmlformats.org/drawingml/2006/main" noChangeAspect="1"/>
                 </wp:cNvGraphicFramePr>
@@ -120,7 +166,7 @@
                   <a:graphicData uri="http://schemas.openxmlformats.org/drawingml/2006/picture">
                     <pic:pic xmlns:pic="http://schemas.openxmlformats.org/drawingml/2006/picture">
                       <pic:nvPicPr>
-                        <pic:cNvPr id="444468233" name="Picture 444468233"/>
+                        <pic:cNvPr id="1680470011" name="Picture 1680470011"/>
                         <pic:cNvPicPr/>
                       </pic:nvPicPr>
                       <pic:blipFill>
@@ -138,7 +184,7 @@
                       <pic:spPr>
                         <a:xfrm>
                           <a:off x="0" y="0"/>
-                          <a:ext cx="1143000" cy="857250"/>
+                          <a:ext cx="1158240" cy="868680"/>
                         </a:xfrm>
                         <a:prstGeom prst="rect">
                           <a:avLst/>
@@ -215,6 +261,7 @@
         </w:tcPr>
         <w:p>
           <w:pPr>
+            <w:spacing w:after="0"/>
             <w:jc w:val="center"/>
             <w:rPr>
               <w:lang w:val="es-CR"/>
@@ -225,10 +272,10 @@
               <w:noProof/>
             </w:rPr>
             <w:drawing>
-              <wp:inline distT="0" distB="0" distL="0" distR="0" wp14:anchorId="5F7B73DD" wp14:editId="623BE0B8">
-                <wp:extent cx="1158240" cy="868680"/>
+              <wp:inline distT="0" distB="0" distL="0" distR="0" wp14:anchorId="3810B10B" wp14:editId="7364D72C">
+                <wp:extent cx="1143000" cy="857250"/>
                 <wp:effectExtent l="0" t="0" r="0" b="0"/>
-                <wp:docPr id="1680470011" name="Picture 2"/>
+                <wp:docPr id="444468233" name="Picture 1"/>
                 <wp:cNvGraphicFramePr>
                   <a:graphicFrameLocks xmlns:a="http://schemas.openxmlformats.org/drawingml/2006/main" noChangeAspect="1"/>
                 </wp:cNvGraphicFramePr>
@@ -236,7 +283,7 @@
                   <a:graphicData uri="http://schemas.openxmlformats.org/drawingml/2006/picture">
                     <pic:pic xmlns:pic="http://schemas.openxmlformats.org/drawingml/2006/picture">
                       <pic:nvPicPr>
-                        <pic:cNvPr id="1680470011" name="Picture 1680470011"/>
+                        <pic:cNvPr id="444468233" name="Picture 444468233"/>
                         <pic:cNvPicPr/>
                       </pic:nvPicPr>
                       <pic:blipFill>
@@ -254,7 +301,7 @@
                       <pic:spPr>
                         <a:xfrm>
                           <a:off x="0" y="0"/>
-                          <a:ext cx="1158240" cy="868680"/>
+                          <a:ext cx="1143000" cy="857250"/>
                         </a:xfrm>
                         <a:prstGeom prst="rect">
                           <a:avLst/>
@@ -276,6 +323,16 @@
       <w:rPr>
         <w:lang w:val="es-CR"/>
       </w:rPr>
+    </w:pPr>
+  </w:p>
+</w:hdr>
+</file>
+
+<file path=word/header3.xml><?xml version="1.0" encoding="utf-8"?>
+<w:hdr xmlns:wpc="http://schemas.microsoft.com/office/word/2010/wordprocessingCanvas" xmlns:cx="http://schemas.microsoft.com/office/drawing/2014/chartex" xmlns:cx1="http://schemas.microsoft.com/office/drawing/2015/9/8/chartex" xmlns:cx2="http://schemas.microsoft.com/office/drawing/2015/10/21/chartex" xmlns:cx3="http://schemas.microsoft.com/office/drawing/2016/5/9/chartex" xmlns:cx4="http://schemas.microsoft.com/office/drawing/2016/5/10/chartex" xmlns:cx5="http://schemas.microsoft.com/office/drawing/2016/5/11/chartex" xmlns:cx6="http://schemas.microsoft.com/office/drawing/2016/5/12/chartex" xmlns:cx7="http://schemas.microsoft.com/office/drawing/2016/5/13/chartex" xmlns:cx8="http://schemas.microsoft.com/office/drawing/2016/5/14/chartex" xmlns:mc="http://schemas.openxmlformats.org/markup-compatibility/2006" xmlns:aink="http://schemas.microsoft.com/office/drawing/2016/ink" xmlns:am3d="http://schemas.microsoft.com/office/drawing/2017/model3d" xmlns:o="urn:schemas-microsoft-com:office:office" xmlns:oel="http://schemas.microsoft.com/office/2019/extlst" xmlns:r="http://schemas.openxmlformats.org/officeDocument/2006/relationships" xmlns:m="http://schemas.openxmlformats.org/officeDocument/2006/math" xmlns:v="urn:schemas-microsoft-com:vml" xmlns:wp14="http://schemas.microsoft.com/office/word/2010/wordprocessingDrawing" xmlns:wp="http://schemas.openxmlformats.org/drawingml/2006/wordprocessingDrawing" xmlns:w10="urn:schemas-microsoft-com:office:word" xmlns:w="http://schemas.openxmlformats.org/wordprocessingml/2006/main" xmlns:w14="http://schemas.microsoft.com/office/word/2010/wordml" xmlns:w15="http://schemas.microsoft.com/office/word/2012/wordml" xmlns:w16cex="http://schemas.microsoft.com/office/word/2018/wordml/cex" xmlns:w16cid="http://schemas.microsoft.com/office/word/2016/wordml/cid" xmlns:w16="http://schemas.microsoft.com/office/word/2018/wordml" xmlns:w16du="http://schemas.microsoft.com/office/word/2023/wordml/word16du" xmlns:w16sdtdh="http://schemas.microsoft.com/office/word/2020/wordml/sdtdatahash" xmlns:w16sdtfl="http://schemas.microsoft.com/office/word/2024/wordml/sdtformatlock" xmlns:w16se="http://schemas.microsoft.com/office/word/2015/wordml/symex" xmlns:wpg="http://schemas.microsoft.com/office/word/2010/wordprocessingGroup" xmlns:wpi="http://schemas.microsoft.com/office/word/2010/wordprocessingInk" xmlns:wne="http://schemas.microsoft.com/office/word/2006/wordml" xmlns:wps="http://schemas.microsoft.com/office/word/2010/wordprocessingShape" mc:Ignorable="w14 w15 w16se w16cid w16 w16cex w16sdtdh w16sdtfl w16du wp14">
+  <w:p>
+    <w:pPr>
+      <w:pStyle w:val="Header"/>
     </w:pPr>
   </w:p>
 </w:hdr>

</xml_diff>